<commit_message>
Use blank delivery_check_note form for warehouse preview and Word template.
Co-authored-by: Cursor <cursoragent@cursor.com>
</commit_message>
<xml_diff>
--- a/delivery_check_note.docx
+++ b/delivery_check_note.docx
@@ -1,5 +1,46 @@
 
-<file path=word/document.xml><?xml version="1.0" encoding="utf-8"?>
+<file path=docProps\app.xml><?xml version="1.0" encoding="utf-8"?>
+<Properties xmlns="http://schemas.openxmlformats.org/officeDocument/2006/extended-properties" xmlns:vt="http://schemas.openxmlformats.org/officeDocument/2006/docPropsVTypes">
+  <Template>Normal</Template>
+  <TotalTime>0</TotalTime>
+  <Application>Microsoft Office Word</Application>
+  <DocSecurity>0</DocSecurity>
+  <ScaleCrop>false</ScaleCrop>
+  <LinksUpToDate>false</LinksUpToDate>
+  <SharedDoc>false</SharedDoc>
+  <HyperlinksChanged>false</HyperlinksChanged>
+  <AppVersion>12.0000</AppVersion>
+</Properties>
+</file>
+
+<file path=docProps\core.xml><?xml version="1.0" encoding="utf-8"?>
+<cp:coreProperties xmlns:cp="http://schemas.openxmlformats.org/package/2006/metadata/core-properties" xmlns:dc="http://purl.org/dc/elements/1.1/" xmlns:dcterms="http://purl.org/dc/terms/" xmlns:dcmitype="http://purl.org/dc/dcmitype/" xmlns:xsi="http://www.w3.org/2001/XMLSchema-instance">
+  <dcterms:created xsi:type="dcterms:W3CDTF">2026-07-28T08:48:18Z</dcterms:created>
+  <dcterms:modified xsi:type="dcterms:W3CDTF">2026-07-28T08:48:18Z</dcterms:modified>
+</cp:coreProperties>
+</file>
+
+<file path=docProps\custom.xml><?xml version="1.0" encoding="utf-8"?>
+<Properties xmlns="http://schemas.openxmlformats.org/officeDocument/2006/custom-properties" xmlns:vt="http://schemas.openxmlformats.org/officeDocument/2006/docPropsVTypes">
+  <property fmtid="{D5CDD505-2E9C-101B-9397-08002B2CF9AE}" pid="2" name="Converter">
+    <vt:lpwstr>SolidFramework v10.0.19910.1</vt:lpwstr>
+  </property>
+  <property fmtid="{D5CDD505-2E9C-101B-9397-08002B2CF9AE}" pid="3" name="Created">
+    <vt:filetime>2026-07-28T00:00:00Z</vt:filetime>
+  </property>
+  <property fmtid="{D5CDD505-2E9C-101B-9397-08002B2CF9AE}" pid="4" name="Creator">
+    <vt:lpwstr>Canon MF1333C/C1333iF/i</vt:lpwstr>
+  </property>
+  <property fmtid="{D5CDD505-2E9C-101B-9397-08002B2CF9AE}" pid="5" name="LastSaved">
+    <vt:filetime>2026-07-28T00:00:00Z</vt:filetime>
+  </property>
+  <property fmtid="{D5CDD505-2E9C-101B-9397-08002B2CF9AE}" pid="6" name="Producer">
+    <vt:lpwstr>Adobe PSL 1.4e for Canon</vt:lpwstr>
+  </property>
+</Properties>
+</file>
+
+<file path=word\document.xml><?xml version="1.0" encoding="utf-8"?>
 <w:document xmlns:mc="http://schemas.openxmlformats.org/markup-compatibility/2006" xmlns:ve="http://schemas.openxmlformats.org/markup-compatibility/2006" xmlns:o="urn:schemas-microsoft-com:office:office" xmlns:r="http://schemas.openxmlformats.org/officeDocument/2006/relationships" xmlns:m="http://schemas.openxmlformats.org/officeDocument/2006/math" xmlns:v="urn:schemas-microsoft-com:vml" xmlns:wp="http://schemas.openxmlformats.org/drawingml/2006/wordprocessingDrawing" xmlns:w10="urn:schemas-microsoft-com:office:word" xmlns:w="http://schemas.openxmlformats.org/wordprocessingml/2006/main" xmlns:wne="http://schemas.microsoft.com/office/word/2006/wordml" xmlns:a="http://schemas.openxmlformats.org/drawingml/2006/main" xmlns:pic="http://schemas.openxmlformats.org/drawingml/2006/picture" xmlns:wpg="http://schemas.microsoft.com/office/word/2010/wordprocessingGroup" xmlns:wps="http://schemas.microsoft.com/office/word/2010/wordprocessingShape" xmlns:w14="http://schemas.microsoft.com/office/word/2010/wordml" mc:Ignorable="w14" xml:space="preserve">
   <w:body>
     <w:p>
@@ -1517,7 +1558,34 @@
 </w:document>
 </file>
 
-<file path=word/styles.xml><?xml version="1.0" encoding="utf-8"?>
+<file path=word\fontTable.xml><?xml version="1.0" encoding="utf-8"?>
+<w:fonts xmlns:r="http://schemas.openxmlformats.org/officeDocument/2006/relationships" xmlns:w="http://schemas.openxmlformats.org/wordprocessingml/2006/main">
+  <w:font w:name="Times New Roman">
+    <w:altName w:val="Times New Roman"/>
+    <w:charset w:val="1"/>
+    <w:family w:val="roman"/>
+    <w:pitch w:val="variable"/>
+  </w:font>
+</w:fonts>
+</file>
+
+<file path=word\settings.xml><?xml version="1.0" encoding="utf-8"?>
+<w:settings xmlns:o="urn:schemas-microsoft-com:office:office" xmlns:r="http://schemas.openxmlformats.org/officeDocument/2006/relationships" xmlns:m="http://schemas.openxmlformats.org/officeDocument/2006/math" xmlns:v="urn:schemas-microsoft-com:vml" xmlns:w10="urn:schemas-microsoft-com:office:word" xmlns:w="http://schemas.openxmlformats.org/wordprocessingml/2006/main" xmlns:sl="http://schemas.openxmlformats.org/schemaLibrary/2006/main">
+  <w:zoom w:percent="120"/>
+  <w:defaultTabStop w:val="720"/>
+  <w:drawingGridHorizontalSpacing w:val="110"/>
+  <w:displayHorizontalDrawingGridEvery w:val="2"/>
+  <w:characterSpacingControl w:val="doNotCompress"/>
+  <w:compat>
+    <w:ulTrailSpace/>
+    <w:shapeLayoutLikeWW8/>
+    <w:useFELayout/>
+    <w:compatSetting w:val="14" w:uri="http://schemas.microsoft.com/office/word" w:name="compatibilityMode"/>
+  </w:compat>
+</w:settings>
+</file>
+
+<file path=word\styles.xml><?xml version="1.0" encoding="utf-8"?>
 <w:styles xmlns:r="http://schemas.openxmlformats.org/officeDocument/2006/relationships" xmlns:w="http://schemas.openxmlformats.org/wordprocessingml/2006/main">
   <w:docDefaults>
     <w:rPrDefault>
@@ -1593,7 +1661,7 @@
 </w:styles>
 </file>
 
-<file path=word/theme/theme1.xml><?xml version="1.0" encoding="utf-8"?>
+<file path=word\theme\theme1.xml><?xml version="1.0" encoding="utf-8"?>
 <a:theme xmlns:a="http://schemas.openxmlformats.org/drawingml/2006/main" name="Office Theme">
   <a:themeElements>
     <a:clrScheme name="Office">

</xml_diff>